<commit_message>
Stop paid requests and ingestion retries for paused jobs
</commit_message>
<xml_diff>
--- a/docs/Quality_Lead_Costing_Guide.docx
+++ b/docs/Quality_Lead_Costing_Guide.docx
@@ -2093,7 +2093,7 @@
               <w:rPr>
                 <w:sz w:val="18"/>
               </w:rPr>
-              <w:t>Completed leads skipped; successful saved stages restored for unfinished leads.</w:t>
+              <w:t>New AI calls and indexing wait while paused; successful saved stages are restored on resume.</w:t>
             </w:r>
           </w:p>
         </w:tc>
@@ -2110,7 +2110,7 @@
               <w:rPr>
                 <w:sz w:val="18"/>
               </w:rPr>
-              <w:t>Pause does not refund in-flight requests. Duplicated provider attempts after failures can still cost.</w:t>
+              <w:t>In-flight calls and late usage can still be billed. Interrupted embedding documents may need batches recomputed on resume.</w:t>
             </w:r>
           </w:p>
         </w:tc>

</xml_diff>